<commit_message>
docs: limit G1.1 to card visibility and actions
</commit_message>
<xml_diff>
--- a/reports/six-goals-functional-tz-2026-07-20/tz-g1-1-for-igor.docx
+++ b/reports/six-goals-functional-tz-2026-07-20/tz-g1-1-for-igor.docx
@@ -464,7 +464,147 @@
         <w:pStyle w:val="Heading1"/>
       </w:pPr>
       <w:r>
-        <w:t>3. Роли</w:t>
+        <w:t>3. Пользователи карточки и видимость данных</w:t>
+      </w:r>
+    </w:p>
+    <w:p>
+      <w:pPr>
+        <w:keepNext/>
+      </w:pPr>
+      <w:r>
+        <w:rPr>
+          <w:rFonts w:ascii="Calibri" w:hAnsi="Calibri"/>
+          <w:b w:val="0"/>
+          <w:color w:val="17202A"/>
+          <w:sz w:val="22"/>
+        </w:rPr>
+        <w:t>G1.1 не создаёт роли, не назначает их пользователям и не определяет устройство permissions. Карточка использует существующую систему ролей и permissions и задаёт только:</w:t>
+      </w:r>
+    </w:p>
+    <w:p>
+      <w:pPr>
+        <w:spacing w:after="80" w:line="300" w:lineRule="exact"/>
+        <w:ind w:left="605" w:hanging="374"/>
+      </w:pPr>
+      <w:r>
+        <w:rPr>
+          <w:rFonts w:ascii="Calibri" w:hAnsi="Calibri"/>
+          <w:color w:val="17202A"/>
+          <w:sz w:val="22"/>
+        </w:rPr>
+        <w:t xml:space="preserve">•  </w:t>
+      </w:r>
+      <w:r>
+        <w:rPr>
+          <w:rFonts w:ascii="Calibri" w:hAnsi="Calibri"/>
+          <w:b w:val="0"/>
+          <w:color w:val="17202A"/>
+          <w:sz w:val="22"/>
+        </w:rPr>
+        <w:t>кто может открыть эту страницу;</w:t>
+      </w:r>
+    </w:p>
+    <w:p>
+      <w:pPr>
+        <w:spacing w:after="80" w:line="300" w:lineRule="exact"/>
+        <w:ind w:left="605" w:hanging="374"/>
+      </w:pPr>
+      <w:r>
+        <w:rPr>
+          <w:rFonts w:ascii="Calibri" w:hAnsi="Calibri"/>
+          <w:color w:val="17202A"/>
+          <w:sz w:val="22"/>
+        </w:rPr>
+        <w:t xml:space="preserve">•  </w:t>
+      </w:r>
+      <w:r>
+        <w:rPr>
+          <w:rFonts w:ascii="Calibri" w:hAnsi="Calibri"/>
+          <w:b w:val="0"/>
+          <w:color w:val="17202A"/>
+          <w:sz w:val="22"/>
+        </w:rPr>
+        <w:t>какие данные видит каждый пользователь карточки;</w:t>
+      </w:r>
+    </w:p>
+    <w:p>
+      <w:pPr>
+        <w:spacing w:after="80" w:line="300" w:lineRule="exact"/>
+        <w:ind w:left="605" w:hanging="374"/>
+      </w:pPr>
+      <w:r>
+        <w:rPr>
+          <w:rFonts w:ascii="Calibri" w:hAnsi="Calibri"/>
+          <w:color w:val="17202A"/>
+          <w:sz w:val="22"/>
+        </w:rPr>
+        <w:t xml:space="preserve">•  </w:t>
+      </w:r>
+      <w:r>
+        <w:rPr>
+          <w:rFonts w:ascii="Calibri" w:hAnsi="Calibri"/>
+          <w:b w:val="0"/>
+          <w:color w:val="17202A"/>
+          <w:sz w:val="22"/>
+        </w:rPr>
+        <w:t>какие действия доступны ему на этой странице;</w:t>
+      </w:r>
+    </w:p>
+    <w:p>
+      <w:pPr>
+        <w:spacing w:after="80" w:line="300" w:lineRule="exact"/>
+        <w:ind w:left="605" w:hanging="374"/>
+      </w:pPr>
+      <w:r>
+        <w:rPr>
+          <w:rFonts w:ascii="Calibri" w:hAnsi="Calibri"/>
+          <w:color w:val="17202A"/>
+          <w:sz w:val="22"/>
+        </w:rPr>
+        <w:t xml:space="preserve">•  </w:t>
+      </w:r>
+      <w:r>
+        <w:rPr>
+          <w:rFonts w:ascii="Calibri" w:hAnsi="Calibri"/>
+          <w:b w:val="0"/>
+          <w:color w:val="17202A"/>
+          <w:sz w:val="22"/>
+        </w:rPr>
+        <w:t>какие сведения должны быть скрыты;</w:t>
+      </w:r>
+    </w:p>
+    <w:p>
+      <w:pPr>
+        <w:spacing w:after="80" w:line="300" w:lineRule="exact"/>
+        <w:ind w:left="605" w:hanging="374"/>
+      </w:pPr>
+      <w:r>
+        <w:rPr>
+          <w:rFonts w:ascii="Calibri" w:hAnsi="Calibri"/>
+          <w:color w:val="17202A"/>
+          <w:sz w:val="22"/>
+        </w:rPr>
+        <w:t xml:space="preserve">•  </w:t>
+      </w:r>
+      <w:r>
+        <w:rPr>
+          <w:rFonts w:ascii="Calibri" w:hAnsi="Calibri"/>
+          <w:b w:val="0"/>
+          <w:color w:val="17202A"/>
+          <w:sz w:val="22"/>
+        </w:rPr>
+        <w:t>что те же ограничения действуют при прямом открытии ссылки.</w:t>
+      </w:r>
+    </w:p>
+    <w:p>
+      <w:r>
+        <w:rPr>
+          <w:rFonts w:ascii="Calibri" w:hAnsi="Calibri"/>
+          <w:b w:val="0"/>
+          <w:color w:val="17202A"/>
+          <w:sz w:val="22"/>
+        </w:rPr>
+        <w:t>Управление ролями и permissions остаётся на существующей странице админ-панели. Назначение Агента экспертной анкете относится к G6.1, общие правила чата - к G1.2, а сквозной staff-доступ - к G6.7.</w:t>
       </w:r>
     </w:p>
     <w:p>
@@ -4912,7 +5052,7 @@
           <w:color w:val="31445A"/>
           <w:sz w:val="19"/>
         </w:rPr>
-        <w:t>2.1</w:t>
+        <w:t>2.2</w:t>
       </w:r>
     </w:p>
     <w:p>

</xml_diff>